<commit_message>
feat(refactor): fix P0/P1/P2 audit issues, optimize tracker/db, add report generators and real-time metrics
</commit_message>
<xml_diff>
--- a/docs/PDR_Audit_Report.docx
+++ b/docs/PDR_Audit_Report.docx
@@ -81,6 +81,158 @@
         <w:t>Hỗ trợ PyTorch batching cho ResNet50, giảm overhead của Python khi chạy nhiều crop cùng một frame.</w:t>
       </w:r>
     </w:p>
+    <w:p>
+      <w:pPr>
+        <w:pStyle w:val="Heading1"/>
+      </w:pPr>
+      <w:r>
+        <w:t>3. Đánh giá độ chính xác (Metrics)</w:t>
+      </w:r>
+    </w:p>
+    <w:p>
+      <w:pPr>
+        <w:jc w:val="center"/>
+      </w:pPr>
+      <w:r>
+        <w:rPr>
+          <w:b/>
+          <w:color w:val="FF0000"/>
+          <w:sz w:val="32"/>
+        </w:rPr>
+        <w:t>⚠️ SỐ LIỆU DEMO — CHƯA ĐO THẬT ⚠️</w:t>
+      </w:r>
+    </w:p>
+    <w:p>
+      <w:r>
+        <w:t>Đánh giá trên thiết bị: Colab T4 GPU (Demo)</w:t>
+      </w:r>
+    </w:p>
+    <w:p>
+      <w:r>
+        <w:t>Mean Accuracy (mA) trên PA-100K test set đạt 89.33%.</w:t>
+      </w:r>
+    </w:p>
+    <w:tbl>
+      <w:tblPr>
+        <w:tblStyle w:val="TableGrid"/>
+        <w:tblW w:type="auto" w:w="0"/>
+        <w:tblLook w:firstColumn="1" w:firstRow="1" w:lastColumn="0" w:lastRow="0" w:noHBand="0" w:noVBand="1" w:val="04A0"/>
+      </w:tblPr>
+      <w:tblGrid>
+        <w:gridCol w:w="4320"/>
+        <w:gridCol w:w="4320"/>
+      </w:tblGrid>
+      <w:tr>
+        <w:tc>
+          <w:tcPr>
+            <w:tcW w:type="dxa" w:w="4320"/>
+          </w:tcPr>
+          <w:p>
+            <w:r>
+              <w:t>Thuộc tính</w:t>
+            </w:r>
+          </w:p>
+        </w:tc>
+        <w:tc>
+          <w:tcPr>
+            <w:tcW w:type="dxa" w:w="4320"/>
+          </w:tcPr>
+          <w:p>
+            <w:r>
+              <w:t>Accuracy (%)</w:t>
+            </w:r>
+          </w:p>
+        </w:tc>
+      </w:tr>
+      <w:tr>
+        <w:tc>
+          <w:tcPr>
+            <w:tcW w:type="dxa" w:w="4320"/>
+          </w:tcPr>
+          <w:p>
+            <w:r>
+              <w:t>gender_female</w:t>
+            </w:r>
+          </w:p>
+        </w:tc>
+        <w:tc>
+          <w:tcPr>
+            <w:tcW w:type="dxa" w:w="4320"/>
+          </w:tcPr>
+          <w:p>
+            <w:r>
+              <w:t>85.20%</w:t>
+            </w:r>
+          </w:p>
+        </w:tc>
+      </w:tr>
+      <w:tr>
+        <w:tc>
+          <w:tcPr>
+            <w:tcW w:type="dxa" w:w="4320"/>
+          </w:tcPr>
+          <w:p>
+            <w:r>
+              <w:t>hat</w:t>
+            </w:r>
+          </w:p>
+        </w:tc>
+        <w:tc>
+          <w:tcPr>
+            <w:tcW w:type="dxa" w:w="4320"/>
+          </w:tcPr>
+          <w:p>
+            <w:r>
+              <w:t>84.70%</w:t>
+            </w:r>
+          </w:p>
+        </w:tc>
+      </w:tr>
+      <w:tr>
+        <w:tc>
+          <w:tcPr>
+            <w:tcW w:type="dxa" w:w="4320"/>
+          </w:tcPr>
+          <w:p>
+            <w:r>
+              <w:t>glasses</w:t>
+            </w:r>
+          </w:p>
+        </w:tc>
+        <w:tc>
+          <w:tcPr>
+            <w:tcW w:type="dxa" w:w="4320"/>
+          </w:tcPr>
+          <w:p>
+            <w:r>
+              <w:t>91.00%</w:t>
+            </w:r>
+          </w:p>
+        </w:tc>
+      </w:tr>
+      <w:tr>
+        <w:tc>
+          <w:tcPr>
+            <w:tcW w:type="dxa" w:w="4320"/>
+          </w:tcPr>
+          <w:p>
+            <w:r>
+              <w:t>backpack</w:t>
+            </w:r>
+          </w:p>
+        </w:tc>
+        <w:tc>
+          <w:tcPr>
+            <w:tcW w:type="dxa" w:w="4320"/>
+          </w:tcPr>
+          <w:p>
+            <w:r>
+              <w:t>96.70%</w:t>
+            </w:r>
+          </w:p>
+        </w:tc>
+      </w:tr>
+    </w:tbl>
     <w:sectPr>
       <w:pgSz w:w="12240" w:h="15840"/>
       <w:pgMar w:top="1440" w:right="1800" w:bottom="1440" w:left="1800" w:header="720" w:footer="720" w:gutter="0"/>

</xml_diff>

<commit_message>
fix(P0-P2): remove hard-coded benchmark data, fix CSV watermark, prove pipeline CSV data, fix README description
</commit_message>
<xml_diff>
--- a/docs/PDR_Audit_Report.docx
+++ b/docs/PDR_Audit_Report.docx
@@ -8,85 +8,22 @@
         <w:jc w:val="center"/>
       </w:pPr>
       <w:r>
-        <w:t>BÁO CÁO AUDIT &amp; ĐẠI PHẪU HỆ THỐNG PDR</w:t>
+        <w:t>BÁO CÁO ĐÁNH GIÁ HỆ THỐNG PDR</w:t>
       </w:r>
     </w:p>
     <w:p>
       <w:r>
-        <w:t>Ngày xuất báo cáo: 08/09/2026</w:t>
-      </w:r>
-    </w:p>
-    <w:p>
-      <w:pPr>
-        <w:pStyle w:val="Heading1"/>
-      </w:pPr>
-      <w:r>
-        <w:t>1. Tổng quan dự án</w:t>
+        <w:t>Ngày xuất báo cáo: 08/09/2026 20:29</w:t>
       </w:r>
     </w:p>
     <w:p>
       <w:r>
-        <w:t>Dự án PDR-System (Person Detection &amp; Retrieval) sử dụng kiến trúc YOLOv8, ByteTrack và ResNet50 để phát hiện và tìm kiếm đối tượng người theo đặc điểm màu sắc và phụ kiện.</w:t>
-      </w:r>
-    </w:p>
-    <w:p>
-      <w:pPr>
-        <w:pStyle w:val="Heading1"/>
-      </w:pPr>
-      <w:r>
-        <w:t>2. Các cải tiến cốt lõi (Refactoring)</w:t>
+        <w:t>Thiết bị đo đạc  : cuda (NVIDIA GeForce GTX 1650)</w:t>
       </w:r>
     </w:p>
     <w:p>
       <w:r>
-        <w:rPr>
-          <w:b/>
-        </w:rPr>
-        <w:t xml:space="preserve">Color Detector: </w:t>
-      </w:r>
-      <w:r>
-        <w:t>Thay thế Trimmed Median bằng thuật toán phân cụm K-Means kết hợp cân bằng trắng (Gray-world normalization) giúp chống nhiễu màu trong điều kiện ánh sáng phức tạp.</w:t>
-      </w:r>
-    </w:p>
-    <w:p>
-      <w:r>
-        <w:rPr>
-          <w:b/>
-        </w:rPr>
-        <w:t xml:space="preserve">Soft Matching: </w:t>
-      </w:r>
-      <w:r>
-        <w:t>Cho phép khoan dung màu sắc (vd: Xanh đậm vs Đen) để không bị mất mục tiêu khi AI nhận dạng chệch một tông màu.</w:t>
-      </w:r>
-    </w:p>
-    <w:p>
-      <w:r>
-        <w:rPr>
-          <w:b/>
-        </w:rPr>
-        <w:t xml:space="preserve">Load Budgeting (Chống tràn RAM): </w:t>
-      </w:r>
-      <w:r>
-        <w:t>Tự động dọn rác các Track ID cũ (Garbage Collection) và ưu tiên phân tích AI cho các người mới xuất hiện (chống nạn đói CNN).</w:t>
-      </w:r>
-    </w:p>
-    <w:p>
-      <w:r>
-        <w:rPr>
-          <w:b/>
-        </w:rPr>
-        <w:t xml:space="preserve">Batch Inference: </w:t>
-      </w:r>
-      <w:r>
-        <w:t>Hỗ trợ PyTorch batching cho ResNet50, giảm overhead của Python khi chạy nhiều crop cùng một frame.</w:t>
-      </w:r>
-    </w:p>
-    <w:p>
-      <w:pPr>
-        <w:pStyle w:val="Heading1"/>
-      </w:pPr>
-      <w:r>
-        <w:t>3. Đánh giá độ chính xác (Metrics)</w:t>
+        <w:t>Thời điểm đo     : 2026-09-08T20:29:29.294194</w:t>
       </w:r>
     </w:p>
     <w:p>
@@ -97,19 +34,368 @@
         <w:rPr>
           <w:b/>
           <w:color w:val="FF0000"/>
-          <w:sz w:val="32"/>
+          <w:sz w:val="28"/>
         </w:rPr>
-        <w:t>⚠️ SỐ LIỆU DEMO — CHƯA ĐO THẬT ⚠️</w:t>
+        <w:t>⚠️  SỐ LIỆU DEMO — CHƯA ĐO THẬT (PAR Evaluation)  ⚠️</w:t>
+      </w:r>
+    </w:p>
+    <w:p>
+      <w:pPr>
+        <w:pStyle w:val="Heading1"/>
+      </w:pPr>
+      <w:r>
+        <w:t>1. Tổng quan hệ thống</w:t>
       </w:r>
     </w:p>
     <w:p>
       <w:r>
-        <w:t>Đánh giá trên thiết bị: Colab T4 GPU (Demo)</w:t>
+        <w:t>PDR-System (Person Detection &amp; Retrieval) kết hợp YOLOv8n (phát hiện người), ByteTrack (theo dõi đa đối tượng), ResNet50 (nhận dạng thuộc tính PAR) và K-Means Clustering trên kênh H-S của không gian màu HSV để phân tích màu sắc trang phục. Cơ chế Soft-Matching Engine cho phép dung sai màu sắc để bù đắp sai số nhận diện của camera.</w:t>
+      </w:r>
+    </w:p>
+    <w:p>
+      <w:pPr>
+        <w:pStyle w:val="Heading1"/>
+      </w:pPr>
+      <w:r>
+        <w:t>2. Đánh giá hiệu năng (Benchmark Latency &amp; FPS)</w:t>
       </w:r>
     </w:p>
     <w:p>
       <w:r>
-        <w:t>Mean Accuracy (mA) trên PA-100K test set đạt 89.33%.</w:t>
+        <w:t>Đo đạc trực tiếp trên phần cứng: cuda (NVIDIA GeForce GTX 1650) (timestamp: 2026-09-08T20:29:29.294194)</w:t>
+      </w:r>
+    </w:p>
+    <w:tbl>
+      <w:tblPr>
+        <w:tblStyle w:val="TableGrid"/>
+        <w:tblW w:type="auto" w:w="0"/>
+        <w:tblLook w:firstColumn="1" w:firstRow="1" w:lastColumn="0" w:lastRow="0" w:noHBand="0" w:noVBand="1" w:val="04A0"/>
+      </w:tblPr>
+      <w:tblGrid>
+        <w:gridCol w:w="2160"/>
+        <w:gridCol w:w="2160"/>
+        <w:gridCol w:w="2160"/>
+        <w:gridCol w:w="2160"/>
+      </w:tblGrid>
+      <w:tr>
+        <w:tc>
+          <w:tcPr>
+            <w:tcW w:type="dxa" w:w="2160"/>
+          </w:tcPr>
+          <w:p>
+            <w:r>
+              <w:t>Module / Thuật toán</w:t>
+            </w:r>
+          </w:p>
+        </w:tc>
+        <w:tc>
+          <w:tcPr>
+            <w:tcW w:type="dxa" w:w="2160"/>
+          </w:tcPr>
+          <w:p>
+            <w:r>
+              <w:t>Độ trễ TB (ms)</w:t>
+            </w:r>
+          </w:p>
+        </w:tc>
+        <w:tc>
+          <w:tcPr>
+            <w:tcW w:type="dxa" w:w="2160"/>
+          </w:tcPr>
+          <w:p>
+            <w:r>
+              <w:t>Độ lệch chuẩn (ms)</w:t>
+            </w:r>
+          </w:p>
+        </w:tc>
+        <w:tc>
+          <w:tcPr>
+            <w:tcW w:type="dxa" w:w="2160"/>
+          </w:tcPr>
+          <w:p>
+            <w:r>
+              <w:t>Tốc độ (FPS)</w:t>
+            </w:r>
+          </w:p>
+        </w:tc>
+      </w:tr>
+      <w:tr>
+        <w:tc>
+          <w:tcPr>
+            <w:tcW w:type="dxa" w:w="2160"/>
+          </w:tcPr>
+          <w:p>
+            <w:r>
+              <w:t>YOLOv8 Detection</w:t>
+            </w:r>
+          </w:p>
+        </w:tc>
+        <w:tc>
+          <w:tcPr>
+            <w:tcW w:type="dxa" w:w="2160"/>
+          </w:tcPr>
+          <w:p>
+            <w:r>
+              <w:t>12.23</w:t>
+            </w:r>
+          </w:p>
+        </w:tc>
+        <w:tc>
+          <w:tcPr>
+            <w:tcW w:type="dxa" w:w="2160"/>
+          </w:tcPr>
+          <w:p>
+            <w:r>
+              <w:t>± 1.57</w:t>
+            </w:r>
+          </w:p>
+        </w:tc>
+        <w:tc>
+          <w:tcPr>
+            <w:tcW w:type="dxa" w:w="2160"/>
+          </w:tcPr>
+          <w:p>
+            <w:r>
+              <w:t>81.7</w:t>
+            </w:r>
+          </w:p>
+        </w:tc>
+      </w:tr>
+      <w:tr>
+        <w:tc>
+          <w:tcPr>
+            <w:tcW w:type="dxa" w:w="2160"/>
+          </w:tcPr>
+          <w:p>
+            <w:r>
+              <w:t>ByteTrack MOT</w:t>
+            </w:r>
+          </w:p>
+        </w:tc>
+        <w:tc>
+          <w:tcPr>
+            <w:tcW w:type="dxa" w:w="2160"/>
+          </w:tcPr>
+          <w:p>
+            <w:r>
+              <w:t>13.73</w:t>
+            </w:r>
+          </w:p>
+        </w:tc>
+        <w:tc>
+          <w:tcPr>
+            <w:tcW w:type="dxa" w:w="2160"/>
+          </w:tcPr>
+          <w:p>
+            <w:r>
+              <w:t>± 2.21</w:t>
+            </w:r>
+          </w:p>
+        </w:tc>
+        <w:tc>
+          <w:tcPr>
+            <w:tcW w:type="dxa" w:w="2160"/>
+          </w:tcPr>
+          <w:p>
+            <w:r>
+              <w:t>72.9</w:t>
+            </w:r>
+          </w:p>
+        </w:tc>
+      </w:tr>
+      <w:tr>
+        <w:tc>
+          <w:tcPr>
+            <w:tcW w:type="dxa" w:w="2160"/>
+          </w:tcPr>
+          <w:p>
+            <w:r>
+              <w:t>K-Means Color HSV</w:t>
+            </w:r>
+          </w:p>
+        </w:tc>
+        <w:tc>
+          <w:tcPr>
+            <w:tcW w:type="dxa" w:w="2160"/>
+          </w:tcPr>
+          <w:p>
+            <w:r>
+              <w:t>0.55</w:t>
+            </w:r>
+          </w:p>
+        </w:tc>
+        <w:tc>
+          <w:tcPr>
+            <w:tcW w:type="dxa" w:w="2160"/>
+          </w:tcPr>
+          <w:p>
+            <w:r>
+              <w:t>± 0.23</w:t>
+            </w:r>
+          </w:p>
+        </w:tc>
+        <w:tc>
+          <w:tcPr>
+            <w:tcW w:type="dxa" w:w="2160"/>
+          </w:tcPr>
+          <w:p>
+            <w:r>
+              <w:t>1821.4</w:t>
+            </w:r>
+          </w:p>
+        </w:tc>
+      </w:tr>
+      <w:tr>
+        <w:tc>
+          <w:tcPr>
+            <w:tcW w:type="dxa" w:w="2160"/>
+          </w:tcPr>
+          <w:p>
+            <w:r>
+              <w:t>ResNet50 PAR</w:t>
+            </w:r>
+          </w:p>
+        </w:tc>
+        <w:tc>
+          <w:tcPr>
+            <w:tcW w:type="dxa" w:w="2160"/>
+          </w:tcPr>
+          <w:p>
+            <w:r>
+              <w:t>11.58</w:t>
+            </w:r>
+          </w:p>
+        </w:tc>
+        <w:tc>
+          <w:tcPr>
+            <w:tcW w:type="dxa" w:w="2160"/>
+          </w:tcPr>
+          <w:p>
+            <w:r>
+              <w:t>± 1.23</w:t>
+            </w:r>
+          </w:p>
+        </w:tc>
+        <w:tc>
+          <w:tcPr>
+            <w:tcW w:type="dxa" w:w="2160"/>
+          </w:tcPr>
+          <w:p>
+            <w:r>
+              <w:t>86.3</w:t>
+            </w:r>
+          </w:p>
+        </w:tc>
+      </w:tr>
+      <w:tr>
+        <w:tc>
+          <w:tcPr>
+            <w:tcW w:type="dxa" w:w="2160"/>
+          </w:tcPr>
+          <w:p>
+            <w:r>
+              <w:t>Attribute Matching Engine</w:t>
+            </w:r>
+          </w:p>
+        </w:tc>
+        <w:tc>
+          <w:tcPr>
+            <w:tcW w:type="dxa" w:w="2160"/>
+          </w:tcPr>
+          <w:p>
+            <w:r>
+              <w:t>0.00</w:t>
+            </w:r>
+          </w:p>
+        </w:tc>
+        <w:tc>
+          <w:tcPr>
+            <w:tcW w:type="dxa" w:w="2160"/>
+          </w:tcPr>
+          <w:p>
+            <w:r>
+              <w:t>± 0.00</w:t>
+            </w:r>
+          </w:p>
+        </w:tc>
+        <w:tc>
+          <w:tcPr>
+            <w:tcW w:type="dxa" w:w="2160"/>
+          </w:tcPr>
+          <w:p>
+            <w:r>
+              <w:t>367646.8</w:t>
+            </w:r>
+          </w:p>
+        </w:tc>
+      </w:tr>
+      <w:tr>
+        <w:tc>
+          <w:tcPr>
+            <w:tcW w:type="dxa" w:w="2160"/>
+          </w:tcPr>
+          <w:p>
+            <w:r>
+              <w:t>Overall Pipeline</w:t>
+            </w:r>
+          </w:p>
+        </w:tc>
+        <w:tc>
+          <w:tcPr>
+            <w:tcW w:type="dxa" w:w="2160"/>
+          </w:tcPr>
+          <w:p>
+            <w:r>
+              <w:t>13.94</w:t>
+            </w:r>
+          </w:p>
+        </w:tc>
+        <w:tc>
+          <w:tcPr>
+            <w:tcW w:type="dxa" w:w="2160"/>
+          </w:tcPr>
+          <w:p>
+            <w:r>
+              <w:t>± 1.86</w:t>
+            </w:r>
+          </w:p>
+        </w:tc>
+        <w:tc>
+          <w:tcPr>
+            <w:tcW w:type="dxa" w:w="2160"/>
+          </w:tcPr>
+          <w:p>
+            <w:r>
+              <w:t>71.7</w:t>
+            </w:r>
+          </w:p>
+        </w:tc>
+      </w:tr>
+    </w:tbl>
+    <w:p>
+      <w:pPr>
+        <w:pStyle w:val="Heading1"/>
+      </w:pPr>
+      <w:r>
+        <w:t>3. Đánh giá độ chính xác mô hình PAR</w:t>
+      </w:r>
+    </w:p>
+    <w:p>
+      <w:r>
+        <w:t>Thiết bị: Colab T4 GPU (Demo)</w:t>
+      </w:r>
+    </w:p>
+    <w:p>
+      <w:r>
+        <w:t>Mean Accuracy (mA) = 89.33%</w:t>
+      </w:r>
+    </w:p>
+    <w:p>
+      <w:r>
+        <w:rPr>
+          <w:i/>
+        </w:rPr>
+        <w:t>LƯU Ý: Kết quả dưới đây chỉ có Accuracy (từ Colab training). Precision/Recall/F1/TP/FP/FN/TN cần chạy evaluate_par.py trên dataset PA-100K.</w:t>
       </w:r>
     </w:p>
     <w:tbl>
@@ -139,7 +425,7 @@
           </w:tcPr>
           <w:p>
             <w:r>
-              <w:t>Accuracy (%)</w:t>
+              <w:t>Accuracy</w:t>
             </w:r>
           </w:p>
         </w:tc>

</xml_diff>